<commit_message>
Add help section to README and update architecture doc
Co-Authored-By: Claude Sonnet 5 <noreply@anthropic.com>
</commit_message>
<xml_diff>
--- a/docs/Field_Events_Architecture.docx
+++ b/docs/Field_Events_Architecture.docx
@@ -85,6 +85,7 @@
           <w:color w:val="0B769F" w:themeColor="accent4" w:themeShade="BF"/>
           <w:sz w:val="28"/>
           <w:szCs w:val="28"/>
+          <w:rtl/>
           <w:lang w:bidi="he-IL"/>
         </w:rPr>
       </w:pPr>
@@ -131,20 +132,1164 @@
     </w:p>
     <w:p>
       <w:pPr>
-        <w:rPr>
-          <w:lang w:bidi="he-IL"/>
-        </w:rPr>
-      </w:pPr>
-      <w:r>
-        <w:rPr>
-          <w:i/>
-        </w:rPr>
-        <w:t>זרימת ה-Flow הנדרש (המודגש בתרשים): מקור חיצוני -&gt; Ingest API -&gt; Outbox -&gt; OutboxForwarder -&gt; EventsHub -&gt; EventStateMachine/DB -&gt; ClientsHub -&gt; Dispatcher UI</w:t>
-      </w:r>
-    </w:p>
-    <w:p>
-      <w:pPr>
-        <w:rPr>
+        <w:pStyle w:val="a9"/>
+        <w:numPr>
+          <w:ilvl w:val="0"/>
+          <w:numId w:val="21"/>
+        </w:numPr>
+        <w:bidi/>
+        <w:rPr>
+          <w:b/>
+          <w:bCs/>
+          <w:lang w:bidi="he-IL"/>
+        </w:rPr>
+      </w:pPr>
+      <w:proofErr w:type="spellStart"/>
+      <w:r>
+        <w:rPr>
+          <w:rFonts w:hint="cs"/>
+          <w:b/>
+          <w:bCs/>
+          <w:rtl/>
+          <w:lang w:bidi="he-IL"/>
+        </w:rPr>
+        <w:t>מקור</w:t>
+      </w:r>
+      <w:proofErr w:type="spellEnd"/>
+      <w:r>
+        <w:rPr>
+          <w:b/>
+          <w:bCs/>
+          <w:rtl/>
+        </w:rPr>
+        <w:t xml:space="preserve"> חיצוני </w:t>
+      </w:r>
+      <w:r>
+        <w:rPr>
+          <w:rFonts w:hint="cs"/>
+          <w:b/>
+          <w:bCs/>
+          <w:rtl/>
+          <w:lang w:bidi="he-IL"/>
+        </w:rPr>
+        <w:t xml:space="preserve">=&gt; </w:t>
+      </w:r>
+      <w:r>
+        <w:rPr>
+          <w:b/>
+          <w:bCs/>
+          <w:rtl/>
+        </w:rPr>
+        <w:t>מקור חיצוני</w:t>
+      </w:r>
+    </w:p>
+    <w:p>
+      <w:pPr>
+        <w:pStyle w:val="a9"/>
+        <w:bidi/>
+        <w:rPr>
+          <w:lang w:bidi="he-IL"/>
+        </w:rPr>
+      </w:pPr>
+      <w:r>
+        <w:rPr>
+          <w:rtl/>
+        </w:rPr>
+        <w:t>מערכת חיצונית כלשהי שולחת אירוע אל ה</w:t>
+      </w:r>
+      <w:r>
+        <w:rPr>
+          <w:lang w:bidi="he-IL"/>
+        </w:rPr>
+        <w:t>-</w:t>
+      </w:r>
+      <w:r>
+        <w:rPr>
+          <w:rFonts w:hint="cs"/>
+          <w:rtl/>
+          <w:lang w:bidi="he-IL"/>
+        </w:rPr>
+        <w:t xml:space="preserve"> </w:t>
+      </w:r>
+      <w:r>
+        <w:rPr>
+          <w:lang w:bidi="he-IL"/>
+        </w:rPr>
+        <w:t>AGENT</w:t>
+      </w:r>
+      <w:r>
+        <w:rPr>
+          <w:rFonts w:hint="cs"/>
+          <w:rtl/>
+          <w:lang w:bidi="he-IL"/>
+        </w:rPr>
+        <w:t xml:space="preserve"> </w:t>
+      </w:r>
+      <w:r>
+        <w:rPr>
+          <w:rtl/>
+        </w:rPr>
+        <w:t>באמצעות נקודת קצה</w:t>
+      </w:r>
+      <w:r>
+        <w:rPr>
+          <w:rFonts w:hint="cs"/>
+          <w:rtl/>
+          <w:lang w:bidi="he-IL"/>
+        </w:rPr>
+        <w:t xml:space="preserve"> (</w:t>
+      </w:r>
+      <w:r>
+        <w:rPr>
+          <w:lang w:bidi="he-IL"/>
+        </w:rPr>
+        <w:t xml:space="preserve">API </w:t>
+      </w:r>
+      <w:r>
+        <w:rPr>
+          <w:rFonts w:hint="cs"/>
+          <w:rtl/>
+          <w:lang w:bidi="he-IL"/>
+        </w:rPr>
+        <w:t xml:space="preserve">). </w:t>
+      </w:r>
+      <w:r>
+        <w:rPr>
+          <w:rtl/>
+        </w:rPr>
+        <w:t>השרת המקומי קולט את הנתונים, מאמת אותם, ומחזיר מיד אישור קבלה</w:t>
+      </w:r>
+      <w:r>
+        <w:rPr>
+          <w:rFonts w:hint="cs"/>
+          <w:rtl/>
+          <w:lang w:bidi="he-IL"/>
+        </w:rPr>
+        <w:t>.</w:t>
+      </w:r>
+    </w:p>
+    <w:p>
+      <w:pPr>
+        <w:pStyle w:val="a9"/>
+        <w:numPr>
+          <w:ilvl w:val="0"/>
+          <w:numId w:val="21"/>
+        </w:numPr>
+        <w:bidi/>
+        <w:rPr>
+          <w:b/>
+          <w:bCs/>
+          <w:lang w:bidi="he-IL"/>
+        </w:rPr>
+      </w:pPr>
+      <w:r>
+        <w:rPr>
+          <w:lang w:bidi="he-IL"/>
+        </w:rPr>
+        <w:t>I</w:t>
+      </w:r>
+      <w:r>
+        <w:rPr>
+          <w:b/>
+          <w:bCs/>
+          <w:lang w:bidi="he-IL"/>
+        </w:rPr>
+        <w:t>ngest API -&gt; Outbox</w:t>
+      </w:r>
+      <w:r>
+        <w:rPr>
+          <w:rFonts w:hint="cs"/>
+          <w:b/>
+          <w:bCs/>
+          <w:rtl/>
+          <w:lang w:bidi="he-IL"/>
+        </w:rPr>
+        <w:t xml:space="preserve"> </w:t>
+      </w:r>
+    </w:p>
+    <w:p>
+      <w:pPr>
+        <w:pStyle w:val="a9"/>
+        <w:bidi/>
+        <w:rPr>
+          <w:rtl/>
+          <w:lang w:bidi="he-IL"/>
+        </w:rPr>
+      </w:pPr>
+      <w:r>
+        <w:rPr>
+          <w:rtl/>
+        </w:rPr>
+        <w:t>כדי להבטיח שאף אירוע לא ילך לאיבוד</w:t>
+      </w:r>
+      <w:r>
+        <w:rPr>
+          <w:lang w:bidi="he-IL"/>
+        </w:rPr>
+        <w:t xml:space="preserve"> (Zero-Loss), </w:t>
+      </w:r>
+      <w:r>
+        <w:rPr>
+          <w:rtl/>
+        </w:rPr>
+        <w:t>ה</w:t>
+      </w:r>
+      <w:r>
+        <w:rPr>
+          <w:lang w:bidi="he-IL"/>
+        </w:rPr>
+        <w:t xml:space="preserve">-Agent </w:t>
+      </w:r>
+      <w:r>
+        <w:rPr>
+          <w:rtl/>
+        </w:rPr>
+        <w:t>כותב את האירוע באופן מיידי ל</w:t>
+      </w:r>
+      <w:r>
+        <w:rPr>
+          <w:lang w:bidi="he-IL"/>
+        </w:rPr>
+        <w:t>-</w:t>
+      </w:r>
+      <w:r>
+        <w:rPr>
+          <w:rFonts w:hint="cs"/>
+          <w:rtl/>
+          <w:lang w:bidi="he-IL"/>
+        </w:rPr>
+        <w:t xml:space="preserve"> </w:t>
+      </w:r>
+      <w:proofErr w:type="gramStart"/>
+      <w:r>
+        <w:rPr>
+          <w:lang w:bidi="he-IL"/>
+        </w:rPr>
+        <w:t>Outbox</w:t>
+      </w:r>
+      <w:r>
+        <w:rPr>
+          <w:lang w:bidi="he-IL"/>
+        </w:rPr>
+        <w:t xml:space="preserve"> </w:t>
+      </w:r>
+      <w:r>
+        <w:rPr>
+          <w:rFonts w:hint="cs"/>
+          <w:rtl/>
+          <w:lang w:bidi="he-IL"/>
+        </w:rPr>
+        <w:t xml:space="preserve"> </w:t>
+      </w:r>
+      <w:r>
+        <w:rPr>
+          <w:rtl/>
+        </w:rPr>
+        <w:t>שנמצא</w:t>
+      </w:r>
+      <w:proofErr w:type="gramEnd"/>
+      <w:r>
+        <w:rPr>
+          <w:rtl/>
+        </w:rPr>
+        <w:t xml:space="preserve"> על הדיסק המקומי</w:t>
+      </w:r>
+      <w:r>
+        <w:rPr>
+          <w:rFonts w:hint="cs"/>
+          <w:rtl/>
+          <w:lang w:bidi="he-IL"/>
+        </w:rPr>
+        <w:t>(</w:t>
+      </w:r>
+      <w:r>
+        <w:rPr>
+          <w:rtl/>
+        </w:rPr>
+        <w:t>ולא רק בזיכרון ה</w:t>
+      </w:r>
+      <w:r>
+        <w:rPr>
+          <w:lang w:bidi="he-IL"/>
+        </w:rPr>
+        <w:t>-RAM.</w:t>
+      </w:r>
+      <w:r>
+        <w:rPr>
+          <w:rFonts w:hint="cs"/>
+          <w:rtl/>
+          <w:lang w:bidi="he-IL"/>
+        </w:rPr>
+        <w:t>)</w:t>
+      </w:r>
+    </w:p>
+    <w:p>
+      <w:pPr>
+        <w:pStyle w:val="a9"/>
+        <w:numPr>
+          <w:ilvl w:val="0"/>
+          <w:numId w:val="21"/>
+        </w:numPr>
+        <w:bidi/>
+        <w:rPr>
+          <w:lang w:bidi="he-IL"/>
+        </w:rPr>
+      </w:pPr>
+      <w:r>
+        <w:rPr>
+          <w:b/>
+          <w:bCs/>
+          <w:lang w:bidi="he-IL"/>
+        </w:rPr>
+        <w:t>Outbox -&gt; OutboxForwarder</w:t>
+      </w:r>
+      <w:proofErr w:type="gramStart"/>
+      <w:r>
+        <w:rPr>
+          <w:b/>
+          <w:bCs/>
+          <w:lang w:bidi="he-IL"/>
+        </w:rPr>
+        <w:t>:</w:t>
+      </w:r>
+      <w:r>
+        <w:rPr>
+          <w:rFonts w:hint="cs"/>
+          <w:rtl/>
+          <w:lang w:bidi="he-IL"/>
+        </w:rPr>
+        <w:t xml:space="preserve"> :</w:t>
+      </w:r>
+      <w:proofErr w:type="gramEnd"/>
+    </w:p>
+    <w:p>
+      <w:pPr>
+        <w:pStyle w:val="a9"/>
+        <w:bidi/>
+        <w:rPr>
+          <w:rtl/>
+          <w:lang w:bidi="he-IL"/>
+        </w:rPr>
+      </w:pPr>
+      <w:r>
+        <w:rPr>
+          <w:rFonts w:hint="cs"/>
+          <w:rtl/>
+          <w:lang w:bidi="he-IL"/>
+        </w:rPr>
+        <w:t>רכיב</w:t>
+      </w:r>
+      <w:r>
+        <w:rPr>
+          <w:rtl/>
+        </w:rPr>
+        <w:t xml:space="preserve"> </w:t>
+      </w:r>
+      <w:r>
+        <w:rPr>
+          <w:rFonts w:hint="cs"/>
+          <w:rtl/>
+          <w:lang w:bidi="he-IL"/>
+        </w:rPr>
+        <w:t>ברקע</w:t>
+      </w:r>
+      <w:r>
+        <w:rPr>
+          <w:rtl/>
+        </w:rPr>
+        <w:t xml:space="preserve"> </w:t>
+      </w:r>
+      <w:r>
+        <w:rPr>
+          <w:rFonts w:hint="cs"/>
+          <w:rtl/>
+          <w:lang w:bidi="he-IL"/>
+        </w:rPr>
+        <w:t>בשם</w:t>
+      </w:r>
+      <w:r>
+        <w:rPr>
+          <w:rtl/>
+        </w:rPr>
+        <w:t xml:space="preserve"> </w:t>
+      </w:r>
+      <w:r>
+        <w:rPr>
+          <w:lang w:bidi="he-IL"/>
+        </w:rPr>
+        <w:t xml:space="preserve">OutboxForwarder </w:t>
+      </w:r>
+      <w:r>
+        <w:rPr>
+          <w:rFonts w:hint="cs"/>
+          <w:rtl/>
+          <w:lang w:bidi="he-IL"/>
+        </w:rPr>
+        <w:t xml:space="preserve"> סורק</w:t>
+      </w:r>
+      <w:r>
+        <w:rPr>
+          <w:rtl/>
+        </w:rPr>
+        <w:t xml:space="preserve"> את </w:t>
+      </w:r>
+      <w:r>
+        <w:rPr>
+          <w:rFonts w:hint="cs"/>
+          <w:rtl/>
+          <w:lang w:bidi="he-IL"/>
+        </w:rPr>
+        <w:t>האירועים</w:t>
+      </w:r>
+      <w:r>
+        <w:rPr>
+          <w:rtl/>
+        </w:rPr>
+        <w:t xml:space="preserve"> </w:t>
+      </w:r>
+      <w:r>
+        <w:rPr>
+          <w:rFonts w:hint="cs"/>
+          <w:rtl/>
+          <w:lang w:bidi="he-IL"/>
+        </w:rPr>
+        <w:t>שממתינים</w:t>
+      </w:r>
+      <w:r>
+        <w:rPr>
+          <w:rtl/>
+        </w:rPr>
+        <w:t xml:space="preserve"> </w:t>
+      </w:r>
+      <w:r>
+        <w:rPr>
+          <w:rFonts w:hint="cs"/>
+          <w:rtl/>
+          <w:lang w:bidi="he-IL"/>
+        </w:rPr>
+        <w:t>בתור</w:t>
+      </w:r>
+      <w:r>
+        <w:rPr>
+          <w:rtl/>
+        </w:rPr>
+        <w:t xml:space="preserve"> המקומי </w:t>
+      </w:r>
+      <w:r>
+        <w:rPr>
+          <w:rFonts w:hint="cs"/>
+          <w:rtl/>
+          <w:lang w:bidi="he-IL"/>
+        </w:rPr>
+        <w:t>ומנסה</w:t>
+      </w:r>
+      <w:r>
+        <w:rPr>
+          <w:rtl/>
+        </w:rPr>
+        <w:t xml:space="preserve"> </w:t>
+      </w:r>
+      <w:r>
+        <w:rPr>
+          <w:rFonts w:hint="cs"/>
+          <w:rtl/>
+          <w:lang w:bidi="he-IL"/>
+        </w:rPr>
+        <w:t>לשלוח</w:t>
+      </w:r>
+      <w:r>
+        <w:rPr>
+          <w:rtl/>
+        </w:rPr>
+        <w:t xml:space="preserve"> אותם באופן </w:t>
+      </w:r>
+      <w:r>
+        <w:rPr>
+          <w:rFonts w:hint="cs"/>
+          <w:rtl/>
+          <w:lang w:bidi="he-IL"/>
+        </w:rPr>
+        <w:t>ארטיבי</w:t>
+      </w:r>
+      <w:r>
+        <w:rPr>
+          <w:rtl/>
+        </w:rPr>
+        <w:t xml:space="preserve"> </w:t>
+      </w:r>
+      <w:r>
+        <w:rPr>
+          <w:rFonts w:hint="cs"/>
+          <w:rtl/>
+          <w:lang w:bidi="he-IL"/>
+        </w:rPr>
+        <w:t>לשרת</w:t>
+      </w:r>
+      <w:r>
+        <w:rPr>
+          <w:rtl/>
+        </w:rPr>
+        <w:t xml:space="preserve"> </w:t>
+      </w:r>
+      <w:r>
+        <w:rPr>
+          <w:rFonts w:hint="cs"/>
+          <w:rtl/>
+          <w:lang w:bidi="he-IL"/>
+        </w:rPr>
+        <w:t>המרכזי</w:t>
+      </w:r>
+      <w:r>
+        <w:rPr>
+          <w:rtl/>
+        </w:rPr>
+        <w:t xml:space="preserve"> באמצעות </w:t>
+      </w:r>
+      <w:r>
+        <w:rPr>
+          <w:rFonts w:hint="cs"/>
+          <w:rtl/>
+          <w:lang w:bidi="he-IL"/>
+        </w:rPr>
+        <w:t>חי</w:t>
+      </w:r>
+      <w:r>
+        <w:rPr>
+          <w:rFonts w:hint="cs"/>
+          <w:rtl/>
+          <w:lang w:bidi="he-IL"/>
+        </w:rPr>
+        <w:t>ב</w:t>
+      </w:r>
+      <w:r>
+        <w:rPr>
+          <w:rFonts w:hint="cs"/>
+          <w:rtl/>
+          <w:lang w:bidi="he-IL"/>
+        </w:rPr>
+        <w:t>ור</w:t>
+      </w:r>
+      <w:r>
+        <w:rPr>
+          <w:rtl/>
+        </w:rPr>
+        <w:t xml:space="preserve"> ה</w:t>
+      </w:r>
+      <w:r>
+        <w:rPr>
+          <w:lang w:bidi="he-IL"/>
+        </w:rPr>
+        <w:t xml:space="preserve">-SignalR </w:t>
+      </w:r>
+      <w:r>
+        <w:rPr>
+          <w:rtl/>
+        </w:rPr>
+        <w:t>תוך תמיכה במנגנוני התאוששות וניסיונות חוזרים בזמן נתקי רשת</w:t>
+      </w:r>
+      <w:r>
+        <w:rPr>
+          <w:rFonts w:hint="cs"/>
+          <w:rtl/>
+          <w:lang w:bidi="he-IL"/>
+        </w:rPr>
+        <w:t>.</w:t>
+      </w:r>
+    </w:p>
+    <w:p>
+      <w:pPr>
+        <w:pStyle w:val="a9"/>
+        <w:numPr>
+          <w:ilvl w:val="0"/>
+          <w:numId w:val="21"/>
+        </w:numPr>
+        <w:bidi/>
+        <w:rPr>
+          <w:lang w:bidi="he-IL"/>
+        </w:rPr>
+      </w:pPr>
+      <w:r>
+        <w:rPr>
+          <w:b/>
+          <w:bCs/>
+          <w:lang w:bidi="he-IL"/>
+        </w:rPr>
+        <w:t>OutboxForwarder -&gt; EventsHub:</w:t>
+      </w:r>
+      <w:r>
+        <w:rPr>
+          <w:rFonts w:hint="cs"/>
+          <w:rtl/>
+          <w:lang w:bidi="he-IL"/>
+        </w:rPr>
+        <w:t xml:space="preserve"> </w:t>
+      </w:r>
+    </w:p>
+    <w:p>
+      <w:pPr>
+        <w:pStyle w:val="a9"/>
+        <w:bidi/>
+        <w:rPr>
+          <w:rtl/>
+          <w:lang w:bidi="he-IL"/>
+        </w:rPr>
+      </w:pPr>
+      <w:r>
+        <w:rPr>
+          <w:rtl/>
+        </w:rPr>
+        <w:t>האירועים המועברים מגיעים דרך ערוץ ה</w:t>
+      </w:r>
+      <w:r>
+        <w:rPr>
+          <w:lang w:bidi="he-IL"/>
+        </w:rPr>
+        <w:t xml:space="preserve">-EventsHub </w:t>
+      </w:r>
+      <w:r>
+        <w:rPr>
+          <w:rtl/>
+        </w:rPr>
+        <w:t xml:space="preserve">אל צד השרת המרכזי. השרת מוודא את תקינותם ומטפל באידמפוטנטיות באמצעות </w:t>
+      </w:r>
+      <w:proofErr w:type="gramStart"/>
+      <w:r>
+        <w:rPr>
+          <w:lang w:bidi="he-IL"/>
+        </w:rPr>
+        <w:t xml:space="preserve">OutboxId </w:t>
+      </w:r>
+      <w:r>
+        <w:rPr>
+          <w:rFonts w:hint="cs"/>
+          <w:rtl/>
+          <w:lang w:bidi="he-IL"/>
+        </w:rPr>
+        <w:t xml:space="preserve"> </w:t>
+      </w:r>
+      <w:r>
+        <w:rPr>
+          <w:rtl/>
+        </w:rPr>
+        <w:t>כדי</w:t>
+      </w:r>
+      <w:proofErr w:type="gramEnd"/>
+      <w:r>
+        <w:rPr>
+          <w:rtl/>
+        </w:rPr>
+        <w:t xml:space="preserve"> למנוע כפילויות אם האירוע נשלח שוב</w:t>
+      </w:r>
+      <w:r>
+        <w:rPr>
+          <w:lang w:bidi="he-IL"/>
+        </w:rPr>
+        <w:t>.</w:t>
+      </w:r>
+    </w:p>
+    <w:p>
+      <w:pPr>
+        <w:pStyle w:val="a9"/>
+        <w:numPr>
+          <w:ilvl w:val="0"/>
+          <w:numId w:val="21"/>
+        </w:numPr>
+        <w:bidi/>
+        <w:rPr>
+          <w:lang w:bidi="he-IL"/>
+        </w:rPr>
+      </w:pPr>
+      <w:r>
+        <w:rPr>
+          <w:lang w:bidi="he-IL"/>
+        </w:rPr>
+        <w:t>EventsHub -&gt; EventStateMachine / DB:</w:t>
+      </w:r>
+    </w:p>
+    <w:p>
+      <w:pPr>
+        <w:pStyle w:val="a9"/>
+        <w:bidi/>
+        <w:rPr>
+          <w:rtl/>
+          <w:lang w:bidi="he-IL"/>
+        </w:rPr>
+      </w:pPr>
+      <w:r>
+        <w:rPr>
+          <w:rtl/>
+        </w:rPr>
+        <w:t>האירוע עובר אימות וניהול סטטוסים קשיח דרך ה</w:t>
+      </w:r>
+      <w:r>
+        <w:rPr>
+          <w:lang w:bidi="he-IL"/>
+        </w:rPr>
+        <w:t xml:space="preserve">-EventStateMachine </w:t>
+      </w:r>
+      <w:r>
+        <w:rPr>
+          <w:rtl/>
+        </w:rPr>
+        <w:t>(שמוודא שהמעבר בין הסטטוסים חוקי מבחינה עסקית), ולאחר מכן הוא נשמר סופית בבסיס הנתונים המרכזי</w:t>
+      </w:r>
+      <w:r>
+        <w:rPr>
+          <w:lang w:bidi="he-IL"/>
+        </w:rPr>
+        <w:t xml:space="preserve"> (DB) </w:t>
+      </w:r>
+      <w:r>
+        <w:rPr>
+          <w:rtl/>
+        </w:rPr>
+        <w:t>תוך שמירת היסטוריית האודיט</w:t>
+      </w:r>
+      <w:r>
+        <w:rPr>
+          <w:lang w:bidi="he-IL"/>
+        </w:rPr>
+        <w:t>.</w:t>
+      </w:r>
+    </w:p>
+    <w:p>
+      <w:pPr>
+        <w:pStyle w:val="a9"/>
+        <w:bidi/>
+        <w:rPr>
+          <w:rtl/>
+          <w:lang w:bidi="he-IL"/>
+        </w:rPr>
+      </w:pPr>
+    </w:p>
+    <w:p>
+      <w:pPr>
+        <w:pStyle w:val="a9"/>
+        <w:bidi/>
+        <w:rPr>
+          <w:rFonts w:hint="cs"/>
+          <w:rtl/>
+          <w:lang w:bidi="he-IL"/>
+        </w:rPr>
+      </w:pPr>
+    </w:p>
+    <w:p>
+      <w:pPr>
+        <w:pStyle w:val="a9"/>
+        <w:numPr>
+          <w:ilvl w:val="0"/>
+          <w:numId w:val="21"/>
+        </w:numPr>
+        <w:bidi/>
+        <w:rPr>
+          <w:lang w:bidi="he-IL"/>
+        </w:rPr>
+      </w:pPr>
+      <w:r>
+        <w:rPr>
+          <w:lang w:bidi="he-IL"/>
+        </w:rPr>
+        <w:lastRenderedPageBreak/>
+        <w:t xml:space="preserve">EventStateMachine / DB -&gt; </w:t>
+      </w:r>
+      <w:proofErr w:type="spellStart"/>
+      <w:r>
+        <w:rPr>
+          <w:lang w:bidi="he-IL"/>
+        </w:rPr>
+        <w:t>ClientsHub</w:t>
+      </w:r>
+      <w:proofErr w:type="spellEnd"/>
+      <w:r>
+        <w:rPr>
+          <w:lang w:bidi="he-IL"/>
+        </w:rPr>
+        <w:t xml:space="preserve"> -&gt; Dispatcher UI:</w:t>
+      </w:r>
+    </w:p>
+    <w:p>
+      <w:pPr>
+        <w:pStyle w:val="a9"/>
+        <w:bidi/>
+        <w:rPr>
+          <w:rFonts w:hint="cs"/>
+          <w:rtl/>
+          <w:lang w:bidi="he-IL"/>
+        </w:rPr>
+      </w:pPr>
+      <w:proofErr w:type="spellStart"/>
+      <w:r>
+        <w:rPr>
+          <w:rtl/>
+        </w:rPr>
+        <w:t>לאחר</w:t>
+      </w:r>
+      <w:proofErr w:type="spellEnd"/>
+      <w:r>
+        <w:rPr>
+          <w:rtl/>
+        </w:rPr>
+        <w:t xml:space="preserve"> </w:t>
+      </w:r>
+      <w:proofErr w:type="spellStart"/>
+      <w:r>
+        <w:rPr>
+          <w:rtl/>
+        </w:rPr>
+        <w:t>שהאירוע</w:t>
+      </w:r>
+      <w:proofErr w:type="spellEnd"/>
+      <w:r>
+        <w:rPr>
+          <w:rtl/>
+        </w:rPr>
+        <w:t xml:space="preserve"> </w:t>
+      </w:r>
+      <w:proofErr w:type="spellStart"/>
+      <w:r>
+        <w:rPr>
+          <w:rtl/>
+        </w:rPr>
+        <w:t>נקלט</w:t>
+      </w:r>
+      <w:proofErr w:type="spellEnd"/>
+      <w:r>
+        <w:rPr>
+          <w:rtl/>
+        </w:rPr>
+        <w:t xml:space="preserve"> </w:t>
+      </w:r>
+      <w:proofErr w:type="spellStart"/>
+      <w:r>
+        <w:rPr>
+          <w:rtl/>
+        </w:rPr>
+        <w:t>ועובד</w:t>
+      </w:r>
+      <w:proofErr w:type="spellEnd"/>
+      <w:r>
+        <w:rPr>
+          <w:rtl/>
+        </w:rPr>
+        <w:t xml:space="preserve"> </w:t>
+      </w:r>
+      <w:proofErr w:type="spellStart"/>
+      <w:r>
+        <w:rPr>
+          <w:rtl/>
+        </w:rPr>
+        <w:t>בהצלחה</w:t>
+      </w:r>
+      <w:proofErr w:type="spellEnd"/>
+      <w:r>
+        <w:rPr>
+          <w:rtl/>
+        </w:rPr>
+        <w:t xml:space="preserve"> </w:t>
+      </w:r>
+      <w:proofErr w:type="spellStart"/>
+      <w:r>
+        <w:rPr>
+          <w:rtl/>
+        </w:rPr>
+        <w:t>בצד</w:t>
+      </w:r>
+      <w:proofErr w:type="spellEnd"/>
+      <w:r>
+        <w:rPr>
+          <w:rtl/>
+        </w:rPr>
+        <w:t xml:space="preserve"> השרת, השרת </w:t>
+      </w:r>
+      <w:proofErr w:type="spellStart"/>
+      <w:r>
+        <w:rPr>
+          <w:rtl/>
+        </w:rPr>
+        <w:t>מעדכן</w:t>
+      </w:r>
+      <w:proofErr w:type="spellEnd"/>
+      <w:r>
+        <w:rPr>
+          <w:rtl/>
+        </w:rPr>
+        <w:t xml:space="preserve"> את </w:t>
+      </w:r>
+      <w:proofErr w:type="spellStart"/>
+      <w:r>
+        <w:rPr>
+          <w:rtl/>
+        </w:rPr>
+        <w:t>הלקוחות</w:t>
+      </w:r>
+      <w:proofErr w:type="spellEnd"/>
+      <w:r>
+        <w:rPr>
+          <w:rtl/>
+        </w:rPr>
+        <w:t xml:space="preserve"> </w:t>
+      </w:r>
+      <w:proofErr w:type="spellStart"/>
+      <w:r>
+        <w:rPr>
+          <w:rtl/>
+        </w:rPr>
+        <w:t>המחוברים</w:t>
+      </w:r>
+      <w:proofErr w:type="spellEnd"/>
+      <w:r>
+        <w:rPr>
+          <w:rtl/>
+        </w:rPr>
+        <w:t xml:space="preserve"> דרך ה</w:t>
+      </w:r>
+      <w:r>
+        <w:rPr>
+          <w:lang w:bidi="he-IL"/>
+        </w:rPr>
+        <w:t>-</w:t>
+      </w:r>
+      <w:proofErr w:type="spellStart"/>
+      <w:proofErr w:type="gramStart"/>
+      <w:r>
+        <w:rPr>
+          <w:lang w:bidi="he-IL"/>
+        </w:rPr>
+        <w:t>ClientsHub</w:t>
+      </w:r>
+      <w:proofErr w:type="spellEnd"/>
+      <w:r>
+        <w:rPr>
+          <w:lang w:bidi="he-IL"/>
+        </w:rPr>
+        <w:t xml:space="preserve"> </w:t>
+      </w:r>
+      <w:r>
+        <w:rPr>
+          <w:rFonts w:hint="cs"/>
+          <w:rtl/>
+          <w:lang w:bidi="he-IL"/>
+        </w:rPr>
+        <w:t xml:space="preserve"> </w:t>
+      </w:r>
+      <w:r>
+        <w:rPr>
+          <w:rtl/>
+        </w:rPr>
+        <w:t>בזמן</w:t>
+      </w:r>
+      <w:proofErr w:type="gramEnd"/>
+      <w:r>
+        <w:rPr>
+          <w:rtl/>
+        </w:rPr>
+        <w:t xml:space="preserve"> </w:t>
+      </w:r>
+      <w:proofErr w:type="spellStart"/>
+      <w:r>
+        <w:rPr>
+          <w:rtl/>
+        </w:rPr>
+        <w:t>אמת</w:t>
+      </w:r>
+      <w:proofErr w:type="spellEnd"/>
+      <w:r>
+        <w:rPr>
+          <w:rtl/>
+        </w:rPr>
+        <w:t xml:space="preserve"> באמצעות</w:t>
+      </w:r>
+      <w:r>
+        <w:rPr>
+          <w:lang w:bidi="he-IL"/>
+        </w:rPr>
+        <w:t xml:space="preserve"> SignalR, </w:t>
+      </w:r>
+      <w:proofErr w:type="spellStart"/>
+      <w:r>
+        <w:rPr>
+          <w:rtl/>
+        </w:rPr>
+        <w:t>כך</w:t>
+      </w:r>
+      <w:proofErr w:type="spellEnd"/>
+      <w:r>
+        <w:rPr>
+          <w:rtl/>
+        </w:rPr>
+        <w:t xml:space="preserve"> ש</w:t>
+      </w:r>
+      <w:r>
+        <w:rPr>
+          <w:lang w:bidi="he-IL"/>
+        </w:rPr>
+        <w:t xml:space="preserve">-Dispatcher UI </w:t>
+      </w:r>
+      <w:r>
+        <w:rPr>
+          <w:rtl/>
+        </w:rPr>
+        <w:t>(</w:t>
+      </w:r>
+      <w:proofErr w:type="spellStart"/>
+      <w:r>
+        <w:rPr>
+          <w:rtl/>
+        </w:rPr>
+        <w:t>ממשק</w:t>
+      </w:r>
+      <w:proofErr w:type="spellEnd"/>
+      <w:r>
+        <w:rPr>
+          <w:rtl/>
+        </w:rPr>
+        <w:t xml:space="preserve"> </w:t>
+      </w:r>
+      <w:proofErr w:type="spellStart"/>
+      <w:r>
+        <w:rPr>
+          <w:rtl/>
+        </w:rPr>
+        <w:t>המשתמש</w:t>
+      </w:r>
+      <w:proofErr w:type="spellEnd"/>
+      <w:r>
+        <w:rPr>
+          <w:rtl/>
+        </w:rPr>
+        <w:t xml:space="preserve"> </w:t>
+      </w:r>
+      <w:proofErr w:type="spellStart"/>
+      <w:r>
+        <w:rPr>
+          <w:rtl/>
+        </w:rPr>
+        <w:t>של</w:t>
+      </w:r>
+      <w:proofErr w:type="spellEnd"/>
+      <w:r>
+        <w:rPr>
+          <w:rtl/>
+        </w:rPr>
+        <w:t xml:space="preserve"> </w:t>
+      </w:r>
+      <w:proofErr w:type="spellStart"/>
+      <w:r>
+        <w:rPr>
+          <w:rtl/>
+        </w:rPr>
+        <w:t>המוקדן</w:t>
+      </w:r>
+      <w:proofErr w:type="spellEnd"/>
+      <w:r>
+        <w:rPr>
+          <w:rtl/>
+        </w:rPr>
+        <w:t>/</w:t>
+      </w:r>
+      <w:proofErr w:type="spellStart"/>
+      <w:r>
+        <w:rPr>
+          <w:rtl/>
+        </w:rPr>
+        <w:t>מנהל</w:t>
+      </w:r>
+      <w:proofErr w:type="spellEnd"/>
+      <w:r>
+        <w:rPr>
+          <w:rtl/>
+        </w:rPr>
+        <w:t xml:space="preserve"> </w:t>
+      </w:r>
+      <w:proofErr w:type="spellStart"/>
+      <w:r>
+        <w:rPr>
+          <w:rtl/>
+        </w:rPr>
+        <w:t>יוכל</w:t>
+      </w:r>
+      <w:proofErr w:type="spellEnd"/>
+      <w:r>
+        <w:rPr>
+          <w:rtl/>
+        </w:rPr>
+        <w:t xml:space="preserve"> </w:t>
+      </w:r>
+      <w:proofErr w:type="spellStart"/>
+      <w:r>
+        <w:rPr>
+          <w:rtl/>
+        </w:rPr>
+        <w:t>להציג</w:t>
+      </w:r>
+      <w:proofErr w:type="spellEnd"/>
+      <w:r>
+        <w:rPr>
+          <w:rtl/>
+        </w:rPr>
+        <w:t xml:space="preserve"> את האירוע </w:t>
+      </w:r>
+      <w:proofErr w:type="spellStart"/>
+      <w:r>
+        <w:rPr>
+          <w:rtl/>
+        </w:rPr>
+        <w:t>המעודכן</w:t>
+      </w:r>
+      <w:proofErr w:type="spellEnd"/>
+      <w:r>
+        <w:rPr>
+          <w:rtl/>
+        </w:rPr>
+        <w:t xml:space="preserve"> </w:t>
+      </w:r>
+      <w:proofErr w:type="spellStart"/>
+      <w:r>
+        <w:rPr>
+          <w:rtl/>
+        </w:rPr>
+        <w:t>ואת</w:t>
+      </w:r>
+      <w:proofErr w:type="spellEnd"/>
+      <w:r>
+        <w:rPr>
+          <w:rtl/>
+        </w:rPr>
+        <w:t xml:space="preserve"> היסטוריית הסטטוסים </w:t>
+      </w:r>
+      <w:proofErr w:type="spellStart"/>
+      <w:r>
+        <w:rPr>
+          <w:rtl/>
+        </w:rPr>
+        <w:t>שלו</w:t>
+      </w:r>
+      <w:proofErr w:type="spellEnd"/>
+      <w:r>
+        <w:rPr>
+          <w:lang w:bidi="he-IL"/>
+        </w:rPr>
+        <w:t>.</w:t>
+      </w:r>
+    </w:p>
+    <w:p>
+      <w:pPr>
+        <w:pStyle w:val="a9"/>
+        <w:bidi/>
+        <w:rPr>
+          <w:rFonts w:hint="cs"/>
+          <w:rtl/>
+          <w:lang w:bidi="he-IL"/>
+        </w:rPr>
+      </w:pPr>
+    </w:p>
+    <w:p>
+      <w:pPr>
+        <w:pStyle w:val="a9"/>
+        <w:bidi/>
+        <w:rPr>
+          <w:rFonts w:hint="cs"/>
+          <w:rtl/>
           <w:lang w:bidi="he-IL"/>
         </w:rPr>
       </w:pPr>
@@ -166,6 +1311,7 @@
           <w:lang w:bidi="he-IL"/>
         </w:rPr>
       </w:pPr>
+      <w:proofErr w:type="spellStart"/>
       <w:r>
         <w:rPr>
           <w:b/>
@@ -174,8 +1320,53 @@
           <w:sz w:val="28"/>
           <w:szCs w:val="28"/>
         </w:rPr>
-        <w:t>תיאור הרכיבים ותפקידם</w:t>
-      </w:r>
+        <w:t>תיאור</w:t>
+      </w:r>
+      <w:proofErr w:type="spellEnd"/>
+      <w:r>
+        <w:rPr>
+          <w:b/>
+          <w:bCs/>
+          <w:color w:val="0B769F" w:themeColor="accent4" w:themeShade="BF"/>
+          <w:sz w:val="28"/>
+          <w:szCs w:val="28"/>
+        </w:rPr>
+        <w:t xml:space="preserve"> </w:t>
+      </w:r>
+      <w:proofErr w:type="spellStart"/>
+      <w:r>
+        <w:rPr>
+          <w:b/>
+          <w:bCs/>
+          <w:color w:val="0B769F" w:themeColor="accent4" w:themeShade="BF"/>
+          <w:sz w:val="28"/>
+          <w:szCs w:val="28"/>
+        </w:rPr>
+        <w:t>הרכיבים</w:t>
+      </w:r>
+      <w:proofErr w:type="spellEnd"/>
+      <w:r>
+        <w:rPr>
+          <w:b/>
+          <w:bCs/>
+          <w:color w:val="0B769F" w:themeColor="accent4" w:themeShade="BF"/>
+          <w:sz w:val="28"/>
+          <w:szCs w:val="28"/>
+        </w:rPr>
+        <w:t xml:space="preserve"> </w:t>
+      </w:r>
+      <w:proofErr w:type="spellStart"/>
+      <w:r>
+        <w:rPr>
+          <w:b/>
+          <w:bCs/>
+          <w:color w:val="0B769F" w:themeColor="accent4" w:themeShade="BF"/>
+          <w:sz w:val="28"/>
+          <w:szCs w:val="28"/>
+        </w:rPr>
+        <w:t>ותפקידם</w:t>
+      </w:r>
+      <w:proofErr w:type="spellEnd"/>
     </w:p>
     <w:p>
       <w:pPr>
@@ -453,7 +1644,6 @@
               <w:jc w:val="right"/>
             </w:pPr>
             <w:r>
-              <w:lastRenderedPageBreak/>
               <w:t>Server (FieldEvents.Server)</w:t>
             </w:r>
           </w:p>
@@ -469,11 +1659,19 @@
             <w:r>
               <w:t>"</w:t>
             </w:r>
-            <w:r>
-              <w:rPr>
-                <w:rtl/>
-              </w:rPr>
-              <w:t>מקור האמת" - הלוגיקה העסקית</w:t>
+            <w:proofErr w:type="spellStart"/>
+            <w:r>
+              <w:rPr>
+                <w:rtl/>
+              </w:rPr>
+              <w:t>מקור</w:t>
+            </w:r>
+            <w:proofErr w:type="spellEnd"/>
+            <w:r>
+              <w:rPr>
+                <w:rtl/>
+              </w:rPr>
+              <w:t xml:space="preserve"> האמת" - הלוגיקה העסקית</w:t>
             </w:r>
           </w:p>
         </w:tc>
@@ -1615,6 +2813,7 @@
         <w:rPr>
           <w:noProof/>
         </w:rPr>
+        <w:lastRenderedPageBreak/>
         <w:drawing>
           <wp:inline distT="0" distB="0" distL="0" distR="0" wp14:anchorId="1433020A" wp14:editId="13797BD2">
             <wp:extent cx="5274310" cy="4766507"/>
@@ -1930,7 +3129,6 @@
           <w:rtl/>
           <w:lang w:bidi="he-IL"/>
         </w:rPr>
-        <w:lastRenderedPageBreak/>
         <w:t>מנגנון התקשרות עם השרת</w:t>
       </w:r>
     </w:p>
@@ -3008,6 +4206,7 @@
         <w:rPr>
           <w:noProof/>
         </w:rPr>
+        <w:lastRenderedPageBreak/>
         <w:drawing>
           <wp:inline distT="0" distB="0" distL="0" distR="0" wp14:anchorId="7CA08364" wp14:editId="31C950BE">
             <wp:extent cx="5274310" cy="3474481"/>
@@ -3490,7 +4689,6 @@
               <w:bidi/>
             </w:pPr>
             <w:r>
-              <w:lastRenderedPageBreak/>
               <w:t>X-Agent-Key</w:t>
             </w:r>
           </w:p>
@@ -3508,7 +4706,6 @@
               </w:rPr>
             </w:pPr>
             <w:r>
-              <w:lastRenderedPageBreak/>
               <w:t>מבדיל בבירור בין שירות פנימי מהימן לבין משתמש אנושי</w:t>
             </w:r>
             <w:r>
@@ -3535,8 +4732,14 @@
               <w:bidi/>
               <w:jc w:val="right"/>
             </w:pPr>
-            <w:r>
-              <w:t>מקור חיצוני -&gt; Agent</w:t>
+            <w:proofErr w:type="spellStart"/>
+            <w:r>
+              <w:lastRenderedPageBreak/>
+              <w:t>מקור</w:t>
+            </w:r>
+            <w:proofErr w:type="spellEnd"/>
+            <w:r>
+              <w:t xml:space="preserve"> חיצוני -&gt; Agent</w:t>
             </w:r>
           </w:p>
         </w:tc>
@@ -3566,7 +4769,15 @@
               </w:rPr>
             </w:pPr>
             <w:r>
-              <w:t>כל מקור מזוהה ומבוקר בנפרד; מפתח שנפגם ניתן לביטול נקודתי</w:t>
+              <w:t xml:space="preserve">כל </w:t>
+            </w:r>
+            <w:proofErr w:type="spellStart"/>
+            <w:r>
+              <w:t>מקור</w:t>
+            </w:r>
+            <w:proofErr w:type="spellEnd"/>
+            <w:r>
+              <w:t xml:space="preserve"> מזוהה ומבוקר בנפרד; מפתח שנפגם ניתן לביטול נקודתי</w:t>
             </w:r>
             <w:r>
               <w:rPr>
@@ -6963,6 +8174,119 @@
 <file path=word/numbering.xml><?xml version="1.0" encoding="utf-8"?>
 <w:numbering xmlns:wpc="http://schemas.microsoft.com/office/word/2010/wordprocessingCanvas" xmlns:cx="http://schemas.microsoft.com/office/drawing/2014/chartex" xmlns:cx1="http://schemas.microsoft.com/office/drawing/2015/9/8/chartex" xmlns:cx2="http://schemas.microsoft.com/office/drawing/2015/10/21/chartex" xmlns:cx3="http://schemas.microsoft.com/office/drawing/2016/5/9/chartex" xmlns:cx4="http://schemas.microsoft.com/office/drawing/2016/5/10/chartex" xmlns:cx5="http://schemas.microsoft.com/office/drawing/2016/5/11/chartex" xmlns:cx6="http://schemas.microsoft.com/office/drawing/2016/5/12/chartex" xmlns:cx7="http://schemas.microsoft.com/office/drawing/2016/5/13/chartex" xmlns:cx8="http://schemas.microsoft.com/office/drawing/2016/5/14/chartex" xmlns:mc="http://schemas.openxmlformats.org/markup-compatibility/2006" xmlns:aink="http://schemas.microsoft.com/office/drawing/2016/ink" xmlns:am3d="http://schemas.microsoft.com/office/drawing/2017/model3d" xmlns:o="urn:schemas-microsoft-com:office:office" xmlns:oel="http://schemas.microsoft.com/office/2019/extlst" xmlns:r="http://schemas.openxmlformats.org/officeDocument/2006/relationships" xmlns:m="http://schemas.openxmlformats.org/officeDocument/2006/math" xmlns:v="urn:schemas-microsoft-com:vml" xmlns:wp14="http://schemas.microsoft.com/office/word/2010/wordprocessingDrawing" xmlns:wp="http://schemas.openxmlformats.org/drawingml/2006/wordprocessingDrawing" xmlns:w10="urn:schemas-microsoft-com:office:word" xmlns:w="http://schemas.openxmlformats.org/wordprocessingml/2006/main" xmlns:w14="http://schemas.microsoft.com/office/word/2010/wordml" xmlns:w15="http://schemas.microsoft.com/office/word/2012/wordml" xmlns:w16cex="http://schemas.microsoft.com/office/word/2018/wordml/cex" xmlns:w16cid="http://schemas.microsoft.com/office/word/2016/wordml/cid" xmlns:w16="http://schemas.microsoft.com/office/word/2018/wordml" xmlns:w16du="http://schemas.microsoft.com/office/word/2023/wordml/word16du" xmlns:w16sdtdh="http://schemas.microsoft.com/office/word/2020/wordml/sdtdatahash" xmlns:w16sdtfl="http://schemas.microsoft.com/office/word/2024/wordml/sdtformatlock" xmlns:w16se="http://schemas.microsoft.com/office/word/2015/wordml/symex" xmlns:wpg="http://schemas.microsoft.com/office/word/2010/wordprocessingGroup" xmlns:wpi="http://schemas.microsoft.com/office/word/2010/wordprocessingInk" xmlns:wne="http://schemas.microsoft.com/office/word/2006/wordml" xmlns:wps="http://schemas.microsoft.com/office/word/2010/wordprocessingShape" mc:Ignorable="w14 w15 w16se w16cid w16 w16cex w16sdtdh w16sdtfl w16du wp14">
   <w:abstractNum w:abstractNumId="0" w15:restartNumberingAfterBreak="0">
+    <w:nsid w:val="072553F3"/>
+    <w:multiLevelType w:val="hybridMultilevel"/>
+    <w:tmpl w:val="481A681E"/>
+    <w:lvl w:ilvl="0" w:tplc="04090003">
+      <w:start w:val="1"/>
+      <w:numFmt w:val="bullet"/>
+      <w:lvlText w:val="o"/>
+      <w:lvlJc w:val="left"/>
+      <w:pPr>
+        <w:ind w:left="720" w:hanging="360"/>
+      </w:pPr>
+      <w:rPr>
+        <w:rFonts w:ascii="Courier New" w:hAnsi="Courier New" w:cs="Courier New" w:hint="default"/>
+      </w:rPr>
+    </w:lvl>
+    <w:lvl w:ilvl="1" w:tplc="04090003" w:tentative="1">
+      <w:start w:val="1"/>
+      <w:numFmt w:val="bullet"/>
+      <w:lvlText w:val="o"/>
+      <w:lvlJc w:val="left"/>
+      <w:pPr>
+        <w:ind w:left="1440" w:hanging="360"/>
+      </w:pPr>
+      <w:rPr>
+        <w:rFonts w:ascii="Courier New" w:hAnsi="Courier New" w:cs="Courier New" w:hint="default"/>
+      </w:rPr>
+    </w:lvl>
+    <w:lvl w:ilvl="2" w:tplc="04090005" w:tentative="1">
+      <w:start w:val="1"/>
+      <w:numFmt w:val="bullet"/>
+      <w:lvlText w:val=""/>
+      <w:lvlJc w:val="left"/>
+      <w:pPr>
+        <w:ind w:left="2160" w:hanging="360"/>
+      </w:pPr>
+      <w:rPr>
+        <w:rFonts w:ascii="Wingdings" w:hAnsi="Wingdings" w:hint="default"/>
+      </w:rPr>
+    </w:lvl>
+    <w:lvl w:ilvl="3" w:tplc="04090001" w:tentative="1">
+      <w:start w:val="1"/>
+      <w:numFmt w:val="bullet"/>
+      <w:lvlText w:val=""/>
+      <w:lvlJc w:val="left"/>
+      <w:pPr>
+        <w:ind w:left="2880" w:hanging="360"/>
+      </w:pPr>
+      <w:rPr>
+        <w:rFonts w:ascii="Symbol" w:hAnsi="Symbol" w:hint="default"/>
+      </w:rPr>
+    </w:lvl>
+    <w:lvl w:ilvl="4" w:tplc="04090003" w:tentative="1">
+      <w:start w:val="1"/>
+      <w:numFmt w:val="bullet"/>
+      <w:lvlText w:val="o"/>
+      <w:lvlJc w:val="left"/>
+      <w:pPr>
+        <w:ind w:left="3600" w:hanging="360"/>
+      </w:pPr>
+      <w:rPr>
+        <w:rFonts w:ascii="Courier New" w:hAnsi="Courier New" w:cs="Courier New" w:hint="default"/>
+      </w:rPr>
+    </w:lvl>
+    <w:lvl w:ilvl="5" w:tplc="04090005" w:tentative="1">
+      <w:start w:val="1"/>
+      <w:numFmt w:val="bullet"/>
+      <w:lvlText w:val=""/>
+      <w:lvlJc w:val="left"/>
+      <w:pPr>
+        <w:ind w:left="4320" w:hanging="360"/>
+      </w:pPr>
+      <w:rPr>
+        <w:rFonts w:ascii="Wingdings" w:hAnsi="Wingdings" w:hint="default"/>
+      </w:rPr>
+    </w:lvl>
+    <w:lvl w:ilvl="6" w:tplc="04090001" w:tentative="1">
+      <w:start w:val="1"/>
+      <w:numFmt w:val="bullet"/>
+      <w:lvlText w:val=""/>
+      <w:lvlJc w:val="left"/>
+      <w:pPr>
+        <w:ind w:left="5040" w:hanging="360"/>
+      </w:pPr>
+      <w:rPr>
+        <w:rFonts w:ascii="Symbol" w:hAnsi="Symbol" w:hint="default"/>
+      </w:rPr>
+    </w:lvl>
+    <w:lvl w:ilvl="7" w:tplc="04090003" w:tentative="1">
+      <w:start w:val="1"/>
+      <w:numFmt w:val="bullet"/>
+      <w:lvlText w:val="o"/>
+      <w:lvlJc w:val="left"/>
+      <w:pPr>
+        <w:ind w:left="5760" w:hanging="360"/>
+      </w:pPr>
+      <w:rPr>
+        <w:rFonts w:ascii="Courier New" w:hAnsi="Courier New" w:cs="Courier New" w:hint="default"/>
+      </w:rPr>
+    </w:lvl>
+    <w:lvl w:ilvl="8" w:tplc="04090005" w:tentative="1">
+      <w:start w:val="1"/>
+      <w:numFmt w:val="bullet"/>
+      <w:lvlText w:val=""/>
+      <w:lvlJc w:val="left"/>
+      <w:pPr>
+        <w:ind w:left="6480" w:hanging="360"/>
+      </w:pPr>
+      <w:rPr>
+        <w:rFonts w:ascii="Wingdings" w:hAnsi="Wingdings" w:hint="default"/>
+      </w:rPr>
+    </w:lvl>
+  </w:abstractNum>
+  <w:abstractNum w:abstractNumId="1" w15:restartNumberingAfterBreak="0">
     <w:nsid w:val="08500BE8"/>
     <w:multiLevelType w:val="multilevel"/>
     <w:tmpl w:val="07720870"/>
@@ -7111,7 +8435,7 @@
       </w:rPr>
     </w:lvl>
   </w:abstractNum>
-  <w:abstractNum w:abstractNumId="1" w15:restartNumberingAfterBreak="0">
+  <w:abstractNum w:abstractNumId="2" w15:restartNumberingAfterBreak="0">
     <w:nsid w:val="18FE7785"/>
     <w:multiLevelType w:val="hybridMultilevel"/>
     <w:tmpl w:val="E12E35F8"/>
@@ -7224,7 +8548,7 @@
       </w:rPr>
     </w:lvl>
   </w:abstractNum>
-  <w:abstractNum w:abstractNumId="2" w15:restartNumberingAfterBreak="0">
+  <w:abstractNum w:abstractNumId="3" w15:restartNumberingAfterBreak="0">
     <w:nsid w:val="19297BFB"/>
     <w:multiLevelType w:val="multilevel"/>
     <w:tmpl w:val="55C013A2"/>
@@ -7373,7 +8697,7 @@
       </w:rPr>
     </w:lvl>
   </w:abstractNum>
-  <w:abstractNum w:abstractNumId="3" w15:restartNumberingAfterBreak="0">
+  <w:abstractNum w:abstractNumId="4" w15:restartNumberingAfterBreak="0">
     <w:nsid w:val="1AEE5151"/>
     <w:multiLevelType w:val="multilevel"/>
     <w:tmpl w:val="E9644D06"/>
@@ -7494,7 +8818,7 @@
       </w:rPr>
     </w:lvl>
   </w:abstractNum>
-  <w:abstractNum w:abstractNumId="4" w15:restartNumberingAfterBreak="0">
+  <w:abstractNum w:abstractNumId="5" w15:restartNumberingAfterBreak="0">
     <w:nsid w:val="208F58AB"/>
     <w:multiLevelType w:val="multilevel"/>
     <w:tmpl w:val="E47855D4"/>
@@ -7643,7 +8967,7 @@
       </w:rPr>
     </w:lvl>
   </w:abstractNum>
-  <w:abstractNum w:abstractNumId="5" w15:restartNumberingAfterBreak="0">
+  <w:abstractNum w:abstractNumId="6" w15:restartNumberingAfterBreak="0">
     <w:nsid w:val="301313C8"/>
     <w:multiLevelType w:val="multilevel"/>
     <w:tmpl w:val="32ECD25A"/>
@@ -7792,7 +9116,7 @@
       </w:rPr>
     </w:lvl>
   </w:abstractNum>
-  <w:abstractNum w:abstractNumId="6" w15:restartNumberingAfterBreak="0">
+  <w:abstractNum w:abstractNumId="7" w15:restartNumberingAfterBreak="0">
     <w:nsid w:val="32A64F81"/>
     <w:multiLevelType w:val="multilevel"/>
     <w:tmpl w:val="90D2762A"/>
@@ -7941,7 +9265,7 @@
       </w:rPr>
     </w:lvl>
   </w:abstractNum>
-  <w:abstractNum w:abstractNumId="7" w15:restartNumberingAfterBreak="0">
+  <w:abstractNum w:abstractNumId="8" w15:restartNumberingAfterBreak="0">
     <w:nsid w:val="38EE37F7"/>
     <w:multiLevelType w:val="hybridMultilevel"/>
     <w:tmpl w:val="B3EC15BC"/>
@@ -8030,7 +9354,7 @@
       </w:pPr>
     </w:lvl>
   </w:abstractNum>
-  <w:abstractNum w:abstractNumId="8" w15:restartNumberingAfterBreak="0">
+  <w:abstractNum w:abstractNumId="9" w15:restartNumberingAfterBreak="0">
     <w:nsid w:val="43056527"/>
     <w:multiLevelType w:val="multilevel"/>
     <w:tmpl w:val="9DF67094"/>
@@ -8179,7 +9503,7 @@
       </w:rPr>
     </w:lvl>
   </w:abstractNum>
-  <w:abstractNum w:abstractNumId="9" w15:restartNumberingAfterBreak="0">
+  <w:abstractNum w:abstractNumId="10" w15:restartNumberingAfterBreak="0">
     <w:nsid w:val="44E54EB1"/>
     <w:multiLevelType w:val="multilevel"/>
     <w:tmpl w:val="633C7722"/>
@@ -8328,7 +9652,7 @@
       </w:rPr>
     </w:lvl>
   </w:abstractNum>
-  <w:abstractNum w:abstractNumId="10" w15:restartNumberingAfterBreak="0">
+  <w:abstractNum w:abstractNumId="11" w15:restartNumberingAfterBreak="0">
     <w:nsid w:val="568D1C36"/>
     <w:multiLevelType w:val="hybridMultilevel"/>
     <w:tmpl w:val="EEFE4FEE"/>
@@ -8441,7 +9765,7 @@
       </w:rPr>
     </w:lvl>
   </w:abstractNum>
-  <w:abstractNum w:abstractNumId="11" w15:restartNumberingAfterBreak="0">
+  <w:abstractNum w:abstractNumId="12" w15:restartNumberingAfterBreak="0">
     <w:nsid w:val="5D5B315E"/>
     <w:multiLevelType w:val="hybridMultilevel"/>
     <w:tmpl w:val="45BEDE78"/>
@@ -8527,7 +9851,7 @@
       </w:pPr>
     </w:lvl>
   </w:abstractNum>
-  <w:abstractNum w:abstractNumId="12" w15:restartNumberingAfterBreak="0">
+  <w:abstractNum w:abstractNumId="13" w15:restartNumberingAfterBreak="0">
     <w:nsid w:val="5FAF0766"/>
     <w:multiLevelType w:val="multilevel"/>
     <w:tmpl w:val="1FD6AE6C"/>
@@ -8676,7 +10000,7 @@
       </w:rPr>
     </w:lvl>
   </w:abstractNum>
-  <w:abstractNum w:abstractNumId="13" w15:restartNumberingAfterBreak="0">
+  <w:abstractNum w:abstractNumId="14" w15:restartNumberingAfterBreak="0">
     <w:nsid w:val="63B55E79"/>
     <w:multiLevelType w:val="multilevel"/>
     <w:tmpl w:val="0409001F"/>
@@ -8762,7 +10086,7 @@
       </w:pPr>
     </w:lvl>
   </w:abstractNum>
-  <w:abstractNum w:abstractNumId="14" w15:restartNumberingAfterBreak="0">
+  <w:abstractNum w:abstractNumId="15" w15:restartNumberingAfterBreak="0">
     <w:nsid w:val="647F181A"/>
     <w:multiLevelType w:val="hybridMultilevel"/>
     <w:tmpl w:val="C92C4782"/>
@@ -8875,7 +10199,7 @@
       </w:rPr>
     </w:lvl>
   </w:abstractNum>
-  <w:abstractNum w:abstractNumId="15" w15:restartNumberingAfterBreak="0">
+  <w:abstractNum w:abstractNumId="16" w15:restartNumberingAfterBreak="0">
     <w:nsid w:val="6CA25F24"/>
     <w:multiLevelType w:val="multilevel"/>
     <w:tmpl w:val="758E391E"/>
@@ -9024,7 +10348,7 @@
       </w:rPr>
     </w:lvl>
   </w:abstractNum>
-  <w:abstractNum w:abstractNumId="16" w15:restartNumberingAfterBreak="0">
+  <w:abstractNum w:abstractNumId="17" w15:restartNumberingAfterBreak="0">
     <w:nsid w:val="71FF05EA"/>
     <w:multiLevelType w:val="multilevel"/>
     <w:tmpl w:val="205CAD86"/>
@@ -9173,7 +10497,7 @@
       </w:rPr>
     </w:lvl>
   </w:abstractNum>
-  <w:abstractNum w:abstractNumId="17" w15:restartNumberingAfterBreak="0">
+  <w:abstractNum w:abstractNumId="18" w15:restartNumberingAfterBreak="0">
     <w:nsid w:val="769211B6"/>
     <w:multiLevelType w:val="multilevel"/>
     <w:tmpl w:val="6352D280"/>
@@ -9322,7 +10646,7 @@
       </w:rPr>
     </w:lvl>
   </w:abstractNum>
-  <w:abstractNum w:abstractNumId="18" w15:restartNumberingAfterBreak="0">
+  <w:abstractNum w:abstractNumId="19" w15:restartNumberingAfterBreak="0">
     <w:nsid w:val="7EFF52B5"/>
     <w:multiLevelType w:val="multilevel"/>
     <w:tmpl w:val="41BAD256"/>
@@ -9471,7 +10795,7 @@
       </w:rPr>
     </w:lvl>
   </w:abstractNum>
-  <w:abstractNum w:abstractNumId="19" w15:restartNumberingAfterBreak="0">
+  <w:abstractNum w:abstractNumId="20" w15:restartNumberingAfterBreak="0">
     <w:nsid w:val="7F302794"/>
     <w:multiLevelType w:val="multilevel"/>
     <w:tmpl w:val="2AEAC528"/>
@@ -9621,64 +10945,67 @@
     </w:lvl>
   </w:abstractNum>
   <w:num w:numId="1" w16cid:durableId="401605399">
+    <w:abstractNumId w:val="5"/>
+  </w:num>
+  <w:num w:numId="2" w16cid:durableId="729768034">
+    <w:abstractNumId w:val="9"/>
+  </w:num>
+  <w:num w:numId="3" w16cid:durableId="1525897902">
+    <w:abstractNumId w:val="19"/>
+  </w:num>
+  <w:num w:numId="4" w16cid:durableId="1028606089">
+    <w:abstractNumId w:val="6"/>
+  </w:num>
+  <w:num w:numId="5" w16cid:durableId="384528690">
+    <w:abstractNumId w:val="18"/>
+  </w:num>
+  <w:num w:numId="6" w16cid:durableId="1495681591">
     <w:abstractNumId w:val="4"/>
   </w:num>
-  <w:num w:numId="2" w16cid:durableId="729768034">
+  <w:num w:numId="7" w16cid:durableId="1474635387">
+    <w:abstractNumId w:val="14"/>
+  </w:num>
+  <w:num w:numId="8" w16cid:durableId="442190311">
+    <w:abstractNumId w:val="11"/>
+  </w:num>
+  <w:num w:numId="9" w16cid:durableId="993534823">
+    <w:abstractNumId w:val="12"/>
+  </w:num>
+  <w:num w:numId="10" w16cid:durableId="1340818079">
+    <w:abstractNumId w:val="2"/>
+  </w:num>
+  <w:num w:numId="11" w16cid:durableId="764156131">
+    <w:abstractNumId w:val="15"/>
+  </w:num>
+  <w:num w:numId="12" w16cid:durableId="38013175">
+    <w:abstractNumId w:val="1"/>
+  </w:num>
+  <w:num w:numId="13" w16cid:durableId="1149440316">
+    <w:abstractNumId w:val="3"/>
+  </w:num>
+  <w:num w:numId="14" w16cid:durableId="9450687">
+    <w:abstractNumId w:val="13"/>
+  </w:num>
+  <w:num w:numId="15" w16cid:durableId="1524202566">
+    <w:abstractNumId w:val="10"/>
+  </w:num>
+  <w:num w:numId="16" w16cid:durableId="2030985147">
     <w:abstractNumId w:val="8"/>
   </w:num>
-  <w:num w:numId="3" w16cid:durableId="1525897902">
-    <w:abstractNumId w:val="18"/>
+  <w:num w:numId="17" w16cid:durableId="1384137026">
+    <w:abstractNumId w:val="16"/>
   </w:num>
-  <w:num w:numId="4" w16cid:durableId="1028606089">
-    <w:abstractNumId w:val="5"/>
+  <w:num w:numId="18" w16cid:durableId="1661882183">
+    <w:abstractNumId w:val="7"/>
   </w:num>
-  <w:num w:numId="5" w16cid:durableId="384528690">
+  <w:num w:numId="19" w16cid:durableId="630330074">
+    <w:abstractNumId w:val="20"/>
+  </w:num>
+  <w:num w:numId="20" w16cid:durableId="1298074904">
     <w:abstractNumId w:val="17"/>
   </w:num>
-  <w:num w:numId="6" w16cid:durableId="1495681591">
-    <w:abstractNumId w:val="3"/>
-  </w:num>
-  <w:num w:numId="7" w16cid:durableId="1474635387">
-    <w:abstractNumId w:val="13"/>
-  </w:num>
-  <w:num w:numId="8" w16cid:durableId="442190311">
-    <w:abstractNumId w:val="10"/>
-  </w:num>
-  <w:num w:numId="9" w16cid:durableId="993534823">
-    <w:abstractNumId w:val="11"/>
-  </w:num>
-  <w:num w:numId="10" w16cid:durableId="1340818079">
-    <w:abstractNumId w:val="1"/>
-  </w:num>
-  <w:num w:numId="11" w16cid:durableId="764156131">
-    <w:abstractNumId w:val="14"/>
-  </w:num>
-  <w:num w:numId="12" w16cid:durableId="38013175">
+  <w:num w:numId="21" w16cid:durableId="2031951286">
     <w:abstractNumId w:val="0"/>
-  </w:num>
-  <w:num w:numId="13" w16cid:durableId="1149440316">
-    <w:abstractNumId w:val="2"/>
-  </w:num>
-  <w:num w:numId="14" w16cid:durableId="9450687">
-    <w:abstractNumId w:val="12"/>
-  </w:num>
-  <w:num w:numId="15" w16cid:durableId="1524202566">
-    <w:abstractNumId w:val="9"/>
-  </w:num>
-  <w:num w:numId="16" w16cid:durableId="2030985147">
-    <w:abstractNumId w:val="7"/>
-  </w:num>
-  <w:num w:numId="17" w16cid:durableId="1384137026">
-    <w:abstractNumId w:val="15"/>
-  </w:num>
-  <w:num w:numId="18" w16cid:durableId="1661882183">
-    <w:abstractNumId w:val="6"/>
-  </w:num>
-  <w:num w:numId="19" w16cid:durableId="630330074">
-    <w:abstractNumId w:val="19"/>
-  </w:num>
-  <w:num w:numId="20" w16cid:durableId="1298074904">
-    <w:abstractNumId w:val="16"/>
   </w:num>
 </w:numbering>
 </file>
@@ -10298,7 +11625,6 @@
   <w:style w:type="character" w:default="1" w:styleId="a0">
     <w:name w:val="Default Paragraph Font"/>
     <w:uiPriority w:val="1"/>
-    <w:semiHidden/>
     <w:unhideWhenUsed/>
   </w:style>
   <w:style w:type="table" w:default="1" w:styleId="a1">

</xml_diff>

<commit_message>
Update architecture doc and add bonus question doc
Co-Authored-By: Claude Sonnet 5 <noreply@anthropic.com>
</commit_message>
<xml_diff>
--- a/docs/Field_Events_Architecture.docx
+++ b/docs/Field_Events_Architecture.docx
@@ -144,14 +144,58 @@
           <w:lang w:bidi="he-IL"/>
         </w:rPr>
       </w:pPr>
+      <w:r>
+        <w:rPr>
+          <w:rFonts w:hint="cs"/>
+          <w:b/>
+          <w:bCs/>
+          <w:rtl/>
+          <w:lang w:bidi="he-IL"/>
+        </w:rPr>
+        <w:t>מקור</w:t>
+      </w:r>
+      <w:r>
+        <w:rPr>
+          <w:b/>
+          <w:bCs/>
+          <w:rtl/>
+        </w:rPr>
+        <w:t xml:space="preserve"> </w:t>
+      </w:r>
       <w:proofErr w:type="spellStart"/>
       <w:r>
         <w:rPr>
-          <w:rFonts w:hint="cs"/>
-          <w:b/>
-          <w:bCs/>
-          <w:rtl/>
-          <w:lang w:bidi="he-IL"/>
+          <w:b/>
+          <w:bCs/>
+          <w:rtl/>
+        </w:rPr>
+        <w:t>חיצוני</w:t>
+      </w:r>
+      <w:proofErr w:type="spellEnd"/>
+      <w:r>
+        <w:rPr>
+          <w:b/>
+          <w:bCs/>
+          <w:rtl/>
+        </w:rPr>
+        <w:t xml:space="preserve"> </w:t>
+      </w:r>
+      <w:r>
+        <w:rPr>
+          <w:rFonts w:hint="cs"/>
+          <w:b/>
+          <w:bCs/>
+          <w:rtl/>
+          <w:lang w:bidi="he-IL"/>
+        </w:rPr>
+        <w:t xml:space="preserve">=&gt; </w:t>
+      </w:r>
+      <w:proofErr w:type="spellStart"/>
+      <w:r>
+        <w:rPr>
+          <w:b/>
+          <w:bCs/>
+          <w:rtl/>
         </w:rPr>
         <w:t>מקור</w:t>
       </w:r>
@@ -162,26 +206,18 @@
           <w:bCs/>
           <w:rtl/>
         </w:rPr>
-        <w:t xml:space="preserve"> חיצוני </w:t>
-      </w:r>
-      <w:r>
-        <w:rPr>
-          <w:rFonts w:hint="cs"/>
-          <w:b/>
-          <w:bCs/>
-          <w:rtl/>
-          <w:lang w:bidi="he-IL"/>
-        </w:rPr>
-        <w:t xml:space="preserve">=&gt; </w:t>
-      </w:r>
-      <w:r>
-        <w:rPr>
-          <w:b/>
-          <w:bCs/>
-          <w:rtl/>
-        </w:rPr>
-        <w:t>מקור חיצוני</w:t>
-      </w:r>
+        <w:t xml:space="preserve"> </w:t>
+      </w:r>
+      <w:proofErr w:type="spellStart"/>
+      <w:r>
+        <w:rPr>
+          <w:b/>
+          <w:bCs/>
+          <w:rtl/>
+        </w:rPr>
+        <w:t>חיצוני</w:t>
+      </w:r>
+      <w:proofErr w:type="spellEnd"/>
     </w:p>
     <w:p>
       <w:pPr>
@@ -867,7 +903,6 @@
         <w:pStyle w:val="a9"/>
         <w:bidi/>
         <w:rPr>
-          <w:rFonts w:hint="cs"/>
           <w:rtl/>
           <w:lang w:bidi="he-IL"/>
         </w:rPr>
@@ -912,7 +947,6 @@
         <w:pStyle w:val="a9"/>
         <w:bidi/>
         <w:rPr>
-          <w:rFonts w:hint="cs"/>
           <w:rtl/>
           <w:lang w:bidi="he-IL"/>
         </w:rPr>
@@ -999,13 +1033,41 @@
         <w:rPr>
           <w:rtl/>
         </w:rPr>
-        <w:t xml:space="preserve"> השרת, השרת </w:t>
+        <w:t xml:space="preserve"> </w:t>
       </w:r>
       <w:proofErr w:type="spellStart"/>
       <w:r>
         <w:rPr>
           <w:rtl/>
         </w:rPr>
+        <w:t>השרת</w:t>
+      </w:r>
+      <w:proofErr w:type="spellEnd"/>
+      <w:r>
+        <w:rPr>
+          <w:rtl/>
+        </w:rPr>
+        <w:t xml:space="preserve">, </w:t>
+      </w:r>
+      <w:proofErr w:type="spellStart"/>
+      <w:r>
+        <w:rPr>
+          <w:rtl/>
+        </w:rPr>
+        <w:t>השרת</w:t>
+      </w:r>
+      <w:proofErr w:type="spellEnd"/>
+      <w:r>
+        <w:rPr>
+          <w:rtl/>
+        </w:rPr>
+        <w:t xml:space="preserve"> </w:t>
+      </w:r>
+      <w:proofErr w:type="spellStart"/>
+      <w:r>
+        <w:rPr>
+          <w:rtl/>
+        </w:rPr>
         <w:t>מעדכן</w:t>
       </w:r>
       <w:proofErr w:type="spellEnd"/>
@@ -1013,13 +1075,27 @@
         <w:rPr>
           <w:rtl/>
         </w:rPr>
-        <w:t xml:space="preserve"> את </w:t>
+        <w:t xml:space="preserve"> </w:t>
       </w:r>
       <w:proofErr w:type="spellStart"/>
       <w:r>
         <w:rPr>
           <w:rtl/>
         </w:rPr>
+        <w:t>את</w:t>
+      </w:r>
+      <w:proofErr w:type="spellEnd"/>
+      <w:r>
+        <w:rPr>
+          <w:rtl/>
+        </w:rPr>
+        <w:t xml:space="preserve"> </w:t>
+      </w:r>
+      <w:proofErr w:type="spellStart"/>
+      <w:r>
+        <w:rPr>
+          <w:rtl/>
+        </w:rPr>
         <w:t>הלקוחות</w:t>
       </w:r>
       <w:proofErr w:type="spellEnd"/>
@@ -1041,7 +1117,21 @@
         <w:rPr>
           <w:rtl/>
         </w:rPr>
-        <w:t xml:space="preserve"> דרך ה</w:t>
+        <w:t xml:space="preserve"> </w:t>
+      </w:r>
+      <w:proofErr w:type="spellStart"/>
+      <w:r>
+        <w:rPr>
+          <w:rtl/>
+        </w:rPr>
+        <w:t>דרך</w:t>
+      </w:r>
+      <w:proofErr w:type="spellEnd"/>
+      <w:r>
+        <w:rPr>
+          <w:rtl/>
+        </w:rPr>
+        <w:t xml:space="preserve"> ה</w:t>
       </w:r>
       <w:r>
         <w:rPr>
@@ -1072,12 +1162,14 @@
         </w:rPr>
         <w:t xml:space="preserve"> </w:t>
       </w:r>
+      <w:proofErr w:type="spellStart"/>
       <w:r>
         <w:rPr>
           <w:rtl/>
         </w:rPr>
         <w:t>בזמן</w:t>
       </w:r>
+      <w:proofErr w:type="spellEnd"/>
       <w:proofErr w:type="gramEnd"/>
       <w:r>
         <w:rPr>
@@ -1097,19 +1189,41 @@
         <w:rPr>
           <w:rtl/>
         </w:rPr>
-        <w:t xml:space="preserve"> באמצעות</w:t>
-      </w:r>
-      <w:r>
-        <w:rPr>
-          <w:lang w:bidi="he-IL"/>
-        </w:rPr>
-        <w:t xml:space="preserve"> SignalR, </w:t>
+        <w:t xml:space="preserve"> </w:t>
       </w:r>
       <w:proofErr w:type="spellStart"/>
       <w:r>
         <w:rPr>
           <w:rtl/>
         </w:rPr>
+        <w:t>באמצעות</w:t>
+      </w:r>
+      <w:proofErr w:type="spellEnd"/>
+      <w:r>
+        <w:rPr>
+          <w:lang w:bidi="he-IL"/>
+        </w:rPr>
+        <w:t xml:space="preserve"> </w:t>
+      </w:r>
+      <w:proofErr w:type="spellStart"/>
+      <w:r>
+        <w:rPr>
+          <w:lang w:bidi="he-IL"/>
+        </w:rPr>
+        <w:t>SignalR</w:t>
+      </w:r>
+      <w:proofErr w:type="spellEnd"/>
+      <w:r>
+        <w:rPr>
+          <w:lang w:bidi="he-IL"/>
+        </w:rPr>
+        <w:t xml:space="preserve">, </w:t>
+      </w:r>
+      <w:proofErr w:type="spellStart"/>
+      <w:r>
+        <w:rPr>
+          <w:rtl/>
+        </w:rPr>
         <w:t>כך</w:t>
       </w:r>
       <w:proofErr w:type="spellEnd"/>
@@ -1227,13 +1341,41 @@
         <w:rPr>
           <w:rtl/>
         </w:rPr>
-        <w:t xml:space="preserve"> את האירוע </w:t>
+        <w:t xml:space="preserve"> </w:t>
       </w:r>
       <w:proofErr w:type="spellStart"/>
       <w:r>
         <w:rPr>
           <w:rtl/>
         </w:rPr>
+        <w:t>את</w:t>
+      </w:r>
+      <w:proofErr w:type="spellEnd"/>
+      <w:r>
+        <w:rPr>
+          <w:rtl/>
+        </w:rPr>
+        <w:t xml:space="preserve"> </w:t>
+      </w:r>
+      <w:proofErr w:type="spellStart"/>
+      <w:r>
+        <w:rPr>
+          <w:rtl/>
+        </w:rPr>
+        <w:t>האירוע</w:t>
+      </w:r>
+      <w:proofErr w:type="spellEnd"/>
+      <w:r>
+        <w:rPr>
+          <w:rtl/>
+        </w:rPr>
+        <w:t xml:space="preserve"> </w:t>
+      </w:r>
+      <w:proofErr w:type="spellStart"/>
+      <w:r>
+        <w:rPr>
+          <w:rtl/>
+        </w:rPr>
         <w:t>המעודכן</w:t>
       </w:r>
       <w:proofErr w:type="spellEnd"/>
@@ -1255,13 +1397,41 @@
         <w:rPr>
           <w:rtl/>
         </w:rPr>
-        <w:t xml:space="preserve"> היסטוריית הסטטוסים </w:t>
+        <w:t xml:space="preserve"> </w:t>
       </w:r>
       <w:proofErr w:type="spellStart"/>
       <w:r>
         <w:rPr>
           <w:rtl/>
         </w:rPr>
+        <w:t>היסטוריית</w:t>
+      </w:r>
+      <w:proofErr w:type="spellEnd"/>
+      <w:r>
+        <w:rPr>
+          <w:rtl/>
+        </w:rPr>
+        <w:t xml:space="preserve"> </w:t>
+      </w:r>
+      <w:proofErr w:type="spellStart"/>
+      <w:r>
+        <w:rPr>
+          <w:rtl/>
+        </w:rPr>
+        <w:t>הסטטוסים</w:t>
+      </w:r>
+      <w:proofErr w:type="spellEnd"/>
+      <w:r>
+        <w:rPr>
+          <w:rtl/>
+        </w:rPr>
+        <w:t xml:space="preserve"> </w:t>
+      </w:r>
+      <w:proofErr w:type="spellStart"/>
+      <w:r>
+        <w:rPr>
+          <w:rtl/>
+        </w:rPr>
         <w:t>שלו</w:t>
       </w:r>
       <w:proofErr w:type="spellEnd"/>
@@ -1277,7 +1447,6 @@
         <w:pStyle w:val="a9"/>
         <w:bidi/>
         <w:rPr>
-          <w:rFonts w:hint="cs"/>
           <w:rtl/>
           <w:lang w:bidi="he-IL"/>
         </w:rPr>
@@ -1288,7 +1457,6 @@
         <w:pStyle w:val="a9"/>
         <w:bidi/>
         <w:rPr>
-          <w:rFonts w:hint="cs"/>
           <w:rtl/>
           <w:lang w:bidi="he-IL"/>
         </w:rPr>
@@ -1671,7 +1839,35 @@
               <w:rPr>
                 <w:rtl/>
               </w:rPr>
-              <w:t xml:space="preserve"> האמת" - הלוגיקה העסקית</w:t>
+              <w:t xml:space="preserve"> </w:t>
+            </w:r>
+            <w:proofErr w:type="spellStart"/>
+            <w:r>
+              <w:rPr>
+                <w:rtl/>
+              </w:rPr>
+              <w:t>האמת</w:t>
+            </w:r>
+            <w:proofErr w:type="spellEnd"/>
+            <w:r>
+              <w:rPr>
+                <w:rtl/>
+              </w:rPr>
+              <w:t xml:space="preserve">" - </w:t>
+            </w:r>
+            <w:proofErr w:type="spellStart"/>
+            <w:r>
+              <w:rPr>
+                <w:rtl/>
+              </w:rPr>
+              <w:t>הלוגיקה</w:t>
+            </w:r>
+            <w:proofErr w:type="spellEnd"/>
+            <w:r>
+              <w:rPr>
+                <w:rtl/>
+              </w:rPr>
+              <w:t xml:space="preserve"> העסקית</w:t>
             </w:r>
           </w:p>
         </w:tc>
@@ -2665,90 +2861,6 @@
     </w:p>
     <w:p>
       <w:pPr>
-        <w:bidi/>
-        <w:rPr>
-          <w:rtl/>
-          <w:lang w:bidi="he-IL"/>
-        </w:rPr>
-      </w:pPr>
-    </w:p>
-    <w:p>
-      <w:pPr>
-        <w:bidi/>
-        <w:rPr>
-          <w:rtl/>
-          <w:lang w:bidi="he-IL"/>
-        </w:rPr>
-      </w:pPr>
-    </w:p>
-    <w:p>
-      <w:pPr>
-        <w:bidi/>
-        <w:rPr>
-          <w:rtl/>
-          <w:lang w:bidi="he-IL"/>
-        </w:rPr>
-      </w:pPr>
-    </w:p>
-    <w:p>
-      <w:pPr>
-        <w:bidi/>
-        <w:rPr>
-          <w:rtl/>
-          <w:lang w:bidi="he-IL"/>
-        </w:rPr>
-      </w:pPr>
-    </w:p>
-    <w:p>
-      <w:pPr>
-        <w:bidi/>
-        <w:rPr>
-          <w:rtl/>
-          <w:lang w:bidi="he-IL"/>
-        </w:rPr>
-      </w:pPr>
-    </w:p>
-    <w:p>
-      <w:pPr>
-        <w:bidi/>
-        <w:rPr>
-          <w:rtl/>
-          <w:lang w:bidi="he-IL"/>
-        </w:rPr>
-      </w:pPr>
-    </w:p>
-    <w:p>
-      <w:pPr>
-        <w:pStyle w:val="a9"/>
-        <w:bidi/>
-        <w:rPr>
-          <w:rtl/>
-          <w:lang w:bidi="he-IL"/>
-        </w:rPr>
-      </w:pPr>
-    </w:p>
-    <w:p>
-      <w:pPr>
-        <w:pStyle w:val="a9"/>
-        <w:bidi/>
-        <w:rPr>
-          <w:rtl/>
-          <w:lang w:bidi="he-IL"/>
-        </w:rPr>
-      </w:pPr>
-    </w:p>
-    <w:p>
-      <w:pPr>
-        <w:pStyle w:val="a9"/>
-        <w:bidi/>
-        <w:rPr>
-          <w:rtl/>
-          <w:lang w:bidi="he-IL"/>
-        </w:rPr>
-      </w:pPr>
-    </w:p>
-    <w:p>
-      <w:pPr>
         <w:pStyle w:val="a9"/>
         <w:numPr>
           <w:ilvl w:val="1"/>
@@ -2813,7 +2925,6 @@
         <w:rPr>
           <w:noProof/>
         </w:rPr>
-        <w:lastRenderedPageBreak/>
         <w:drawing>
           <wp:inline distT="0" distB="0" distL="0" distR="0" wp14:anchorId="1433020A" wp14:editId="13797BD2">
             <wp:extent cx="5274310" cy="4766507"/>
@@ -2968,6 +3079,7 @@
           <w:rtl/>
           <w:lang w:bidi="he-IL"/>
         </w:rPr>
+        <w:lastRenderedPageBreak/>
         <w:t xml:space="preserve">             </w:t>
       </w:r>
       <w:r>
@@ -3884,6 +3996,7 @@
           <w:bCs/>
           <w:rtl/>
         </w:rPr>
+        <w:lastRenderedPageBreak/>
         <w:t>הגדרת מעברים קשיחה</w:t>
       </w:r>
       <w:r>
@@ -4206,7 +4319,6 @@
         <w:rPr>
           <w:noProof/>
         </w:rPr>
-        <w:lastRenderedPageBreak/>
         <w:drawing>
           <wp:inline distT="0" distB="0" distL="0" distR="0" wp14:anchorId="7CA08364" wp14:editId="31C950BE">
             <wp:extent cx="5274310" cy="3474481"/>
@@ -4468,6 +4580,56 @@
     <w:p>
       <w:pPr>
         <w:pStyle w:val="a9"/>
+        <w:bidi/>
+        <w:rPr>
+          <w:rtl/>
+          <w:lang w:bidi="he-IL"/>
+        </w:rPr>
+      </w:pPr>
+    </w:p>
+    <w:p>
+      <w:pPr>
+        <w:pStyle w:val="a9"/>
+        <w:bidi/>
+        <w:rPr>
+          <w:rtl/>
+          <w:lang w:bidi="he-IL"/>
+        </w:rPr>
+      </w:pPr>
+    </w:p>
+    <w:p>
+      <w:pPr>
+        <w:pStyle w:val="a9"/>
+        <w:bidi/>
+        <w:rPr>
+          <w:rtl/>
+          <w:lang w:bidi="he-IL"/>
+        </w:rPr>
+      </w:pPr>
+    </w:p>
+    <w:p>
+      <w:pPr>
+        <w:pStyle w:val="a9"/>
+        <w:bidi/>
+        <w:rPr>
+          <w:rtl/>
+          <w:lang w:bidi="he-IL"/>
+        </w:rPr>
+      </w:pPr>
+    </w:p>
+    <w:p>
+      <w:pPr>
+        <w:pStyle w:val="a9"/>
+        <w:bidi/>
+        <w:rPr>
+          <w:rtl/>
+          <w:lang w:bidi="he-IL"/>
+        </w:rPr>
+      </w:pPr>
+    </w:p>
+    <w:p>
+      <w:pPr>
+        <w:pStyle w:val="a9"/>
         <w:numPr>
           <w:ilvl w:val="0"/>
           <w:numId w:val="6"/>
@@ -4493,6 +4655,7 @@
           <w:rtl/>
           <w:lang w:bidi="he-IL"/>
         </w:rPr>
+        <w:lastRenderedPageBreak/>
         <w:t xml:space="preserve">מנגנון אבטחה ואימות </w:t>
       </w:r>
     </w:p>
@@ -4734,12 +4897,19 @@
             </w:pPr>
             <w:proofErr w:type="spellStart"/>
             <w:r>
-              <w:lastRenderedPageBreak/>
               <w:t>מקור</w:t>
             </w:r>
             <w:proofErr w:type="spellEnd"/>
             <w:r>
-              <w:t xml:space="preserve"> חיצוני -&gt; Agent</w:t>
+              <w:t xml:space="preserve"> </w:t>
+            </w:r>
+            <w:proofErr w:type="spellStart"/>
+            <w:r>
+              <w:t>חיצוני</w:t>
+            </w:r>
+            <w:proofErr w:type="spellEnd"/>
+            <w:r>
+              <w:t xml:space="preserve"> -&gt; Agent</w:t>
             </w:r>
           </w:p>
         </w:tc>
@@ -4768,16 +4938,45 @@
                 <w:lang w:bidi="he-IL"/>
               </w:rPr>
             </w:pPr>
-            <w:r>
-              <w:t xml:space="preserve">כל </w:t>
-            </w:r>
             <w:proofErr w:type="spellStart"/>
             <w:r>
+              <w:t>כל</w:t>
+            </w:r>
+            <w:proofErr w:type="spellEnd"/>
+            <w:r>
+              <w:t xml:space="preserve"> </w:t>
+            </w:r>
+            <w:proofErr w:type="spellStart"/>
+            <w:r>
               <w:t>מקור</w:t>
             </w:r>
             <w:proofErr w:type="spellEnd"/>
             <w:r>
-              <w:t xml:space="preserve"> מזוהה ומבוקר בנפרד; מפתח שנפגם ניתן לביטול נקודתי</w:t>
+              <w:t xml:space="preserve"> </w:t>
+            </w:r>
+            <w:proofErr w:type="spellStart"/>
+            <w:r>
+              <w:t>מזוהה</w:t>
+            </w:r>
+            <w:proofErr w:type="spellEnd"/>
+            <w:r>
+              <w:t xml:space="preserve"> </w:t>
+            </w:r>
+            <w:proofErr w:type="spellStart"/>
+            <w:r>
+              <w:t>ומבוקר</w:t>
+            </w:r>
+            <w:proofErr w:type="spellEnd"/>
+            <w:r>
+              <w:t xml:space="preserve"> </w:t>
+            </w:r>
+            <w:proofErr w:type="spellStart"/>
+            <w:r>
+              <w:t>בנפרד</w:t>
+            </w:r>
+            <w:proofErr w:type="spellEnd"/>
+            <w:r>
+              <w:t>; מפתח שנפגם ניתן לביטול נקודתי</w:t>
             </w:r>
             <w:r>
               <w:rPr>
@@ -5306,6 +5505,7 @@
                 <w:rtl/>
                 <w:lang w:bidi="he-IL"/>
               </w:rPr>
+              <w:lastRenderedPageBreak/>
               <w:t xml:space="preserve">ה </w:t>
             </w:r>
             <w:r>
@@ -5658,7 +5858,6 @@
               <w:bidi/>
             </w:pPr>
             <w:r>
-              <w:lastRenderedPageBreak/>
               <w:t>חיבור SignalR של דפדפן נופל (ClientsHub)</w:t>
             </w:r>
           </w:p>
@@ -6607,6 +6806,7 @@
           <w:bCs/>
           <w:lang w:bidi="he-IL"/>
         </w:rPr>
+        <w:lastRenderedPageBreak/>
         <w:t xml:space="preserve">Windows </w:t>
       </w:r>
       <w:proofErr w:type="gramStart"/>
@@ -7215,7 +7415,6 @@
           <w:rtl/>
           <w:lang w:bidi="he-IL"/>
         </w:rPr>
-        <w:lastRenderedPageBreak/>
         <w:t>מגבלות דפדפן בשלב ה</w:t>
       </w:r>
       <w:r>
@@ -8047,6 +8246,7 @@
           <w:rtl/>
           <w:lang w:bidi="he-IL"/>
         </w:rPr>
+        <w:lastRenderedPageBreak/>
         <w:t xml:space="preserve">              </w:t>
       </w:r>
     </w:p>
@@ -11625,6 +11825,7 @@
   <w:style w:type="character" w:default="1" w:styleId="a0">
     <w:name w:val="Default Paragraph Font"/>
     <w:uiPriority w:val="1"/>
+    <w:semiHidden/>
     <w:unhideWhenUsed/>
   </w:style>
   <w:style w:type="table" w:default="1" w:styleId="a1">

</xml_diff>